<commit_message>
Implementar Auth, filtrado por fechas y generacion de Word dinamico por empleado
</commit_message>
<xml_diff>
--- a/public/template.docx
+++ b/public/template.docx
@@ -408,7 +408,8 @@
     </w:p>
     <w:tbl>
       <w:tblPr>
-        <w:tblW w:w="9936" w:type="dxa"/>
+        <w:tblW w:w="10165" w:type="dxa"/>
+        <w:tblInd w:w="-95" w:type="dxa"/>
         <w:tblCellMar>
           <w:left w:w="70" w:type="dxa"/>
           <w:right w:w="70" w:type="dxa"/>
@@ -416,19 +417,19 @@
         <w:tblLook w:val="04A0" w:firstRow="1" w:lastRow="0" w:firstColumn="1" w:lastColumn="0" w:noHBand="0" w:noVBand="1"/>
       </w:tblPr>
       <w:tblGrid>
-        <w:gridCol w:w="1056"/>
-        <w:gridCol w:w="1290"/>
-        <w:gridCol w:w="2955"/>
-        <w:gridCol w:w="2258"/>
-        <w:gridCol w:w="2377"/>
+        <w:gridCol w:w="1890"/>
+        <w:gridCol w:w="1504"/>
+        <w:gridCol w:w="2872"/>
+        <w:gridCol w:w="1836"/>
+        <w:gridCol w:w="2063"/>
       </w:tblGrid>
       <w:tr>
         <w:trPr>
-          <w:trHeight w:val="379"/>
+          <w:trHeight w:val="364"/>
         </w:trPr>
         <w:tc>
           <w:tcPr>
-            <w:tcW w:w="1056" w:type="dxa"/>
+            <w:tcW w:w="1890" w:type="dxa"/>
             <w:tcBorders>
               <w:top w:val="single" w:sz="4" w:space="0" w:color="auto"/>
               <w:left w:val="single" w:sz="4" w:space="0" w:color="auto"/>
@@ -472,7 +473,7 @@
         </w:tc>
         <w:tc>
           <w:tcPr>
-            <w:tcW w:w="1290" w:type="dxa"/>
+            <w:tcW w:w="1504" w:type="dxa"/>
             <w:tcBorders>
               <w:top w:val="single" w:sz="4" w:space="0" w:color="auto"/>
               <w:left w:val="nil"/>
@@ -516,7 +517,7 @@
         </w:tc>
         <w:tc>
           <w:tcPr>
-            <w:tcW w:w="2955" w:type="dxa"/>
+            <w:tcW w:w="2872" w:type="dxa"/>
             <w:tcBorders>
               <w:top w:val="single" w:sz="4" w:space="0" w:color="auto"/>
               <w:left w:val="nil"/>
@@ -560,7 +561,7 @@
         </w:tc>
         <w:tc>
           <w:tcPr>
-            <w:tcW w:w="2258" w:type="dxa"/>
+            <w:tcW w:w="1836" w:type="dxa"/>
             <w:tcBorders>
               <w:top w:val="single" w:sz="4" w:space="0" w:color="auto"/>
               <w:left w:val="nil"/>
@@ -604,7 +605,7 @@
         </w:tc>
         <w:tc>
           <w:tcPr>
-            <w:tcW w:w="2377" w:type="dxa"/>
+            <w:tcW w:w="2063" w:type="dxa"/>
             <w:tcBorders>
               <w:top w:val="single" w:sz="4" w:space="0" w:color="auto"/>
               <w:left w:val="nil"/>
@@ -649,11 +650,11 @@
       </w:tr>
       <w:tr>
         <w:trPr>
-          <w:trHeight w:val="328"/>
+          <w:trHeight w:val="315"/>
         </w:trPr>
         <w:tc>
           <w:tcPr>
-            <w:tcW w:w="1056" w:type="dxa"/>
+            <w:tcW w:w="1890" w:type="dxa"/>
             <w:tcBorders>
               <w:top w:val="nil"/>
               <w:left w:val="single" w:sz="4" w:space="0" w:color="auto"/>
@@ -679,11 +680,43 @@
                 <w:lang w:val="es-VE" w:eastAsia="es-VE"/>
               </w:rPr>
             </w:pPr>
+            <w:r>
+              <w:rPr>
+                <w:rFonts w:eastAsia="Times New Roman"/>
+                <w:color w:val="000000"/>
+                <w:sz w:val="24"/>
+                <w:szCs w:val="24"/>
+                <w:lang w:val="es-VE" w:eastAsia="es-VE"/>
+              </w:rPr>
+              <w:t>{#</w:t>
+            </w:r>
+            <w:proofErr w:type="gramStart"/>
+            <w:r>
+              <w:rPr>
+                <w:rFonts w:eastAsia="Times New Roman"/>
+                <w:color w:val="000000"/>
+                <w:sz w:val="24"/>
+                <w:szCs w:val="24"/>
+                <w:lang w:val="es-VE" w:eastAsia="es-VE"/>
+              </w:rPr>
+              <w:t>facturas}{</w:t>
+            </w:r>
+            <w:proofErr w:type="gramEnd"/>
+            <w:r>
+              <w:rPr>
+                <w:rFonts w:eastAsia="Times New Roman"/>
+                <w:color w:val="000000"/>
+                <w:sz w:val="24"/>
+                <w:szCs w:val="24"/>
+                <w:lang w:val="es-VE" w:eastAsia="es-VE"/>
+              </w:rPr>
+              <w:t>fecha}</w:t>
+            </w:r>
           </w:p>
         </w:tc>
         <w:tc>
           <w:tcPr>
-            <w:tcW w:w="1290" w:type="dxa"/>
+            <w:tcW w:w="1504" w:type="dxa"/>
             <w:tcBorders>
               <w:top w:val="nil"/>
               <w:left w:val="nil"/>
@@ -709,11 +742,43 @@
                 <w:lang w:val="es-VE" w:eastAsia="es-VE"/>
               </w:rPr>
             </w:pPr>
+            <w:r>
+              <w:rPr>
+                <w:rFonts w:eastAsia="Times New Roman"/>
+                <w:color w:val="000000"/>
+                <w:sz w:val="24"/>
+                <w:szCs w:val="24"/>
+                <w:lang w:val="es-VE" w:eastAsia="es-VE"/>
+              </w:rPr>
+              <w:t>{</w:t>
+            </w:r>
+            <w:proofErr w:type="spellStart"/>
+            <w:r>
+              <w:rPr>
+                <w:rFonts w:eastAsia="Times New Roman"/>
+                <w:color w:val="000000"/>
+                <w:sz w:val="24"/>
+                <w:szCs w:val="24"/>
+                <w:lang w:val="es-VE" w:eastAsia="es-VE"/>
+              </w:rPr>
+              <w:t>nro_factura</w:t>
+            </w:r>
+            <w:proofErr w:type="spellEnd"/>
+            <w:r>
+              <w:rPr>
+                <w:rFonts w:eastAsia="Times New Roman"/>
+                <w:color w:val="000000"/>
+                <w:sz w:val="24"/>
+                <w:szCs w:val="24"/>
+                <w:lang w:val="es-VE" w:eastAsia="es-VE"/>
+              </w:rPr>
+              <w:t>}</w:t>
+            </w:r>
           </w:p>
         </w:tc>
         <w:tc>
           <w:tcPr>
-            <w:tcW w:w="2955" w:type="dxa"/>
+            <w:tcW w:w="2872" w:type="dxa"/>
             <w:tcBorders>
               <w:top w:val="nil"/>
               <w:left w:val="nil"/>
@@ -738,11 +803,43 @@
                 <w:lang w:val="es-VE" w:eastAsia="es-VE"/>
               </w:rPr>
             </w:pPr>
+            <w:r>
+              <w:rPr>
+                <w:rFonts w:eastAsia="Times New Roman"/>
+                <w:color w:val="000000"/>
+                <w:sz w:val="24"/>
+                <w:szCs w:val="24"/>
+                <w:lang w:val="es-VE" w:eastAsia="es-VE"/>
+              </w:rPr>
+              <w:t>{</w:t>
+            </w:r>
+            <w:proofErr w:type="spellStart"/>
+            <w:r>
+              <w:rPr>
+                <w:rFonts w:eastAsia="Times New Roman"/>
+                <w:color w:val="000000"/>
+                <w:sz w:val="24"/>
+                <w:szCs w:val="24"/>
+                <w:lang w:val="es-VE" w:eastAsia="es-VE"/>
+              </w:rPr>
+              <w:t>nombre_estacionamiento</w:t>
+            </w:r>
+            <w:proofErr w:type="spellEnd"/>
+            <w:r>
+              <w:rPr>
+                <w:rFonts w:eastAsia="Times New Roman"/>
+                <w:color w:val="000000"/>
+                <w:sz w:val="24"/>
+                <w:szCs w:val="24"/>
+                <w:lang w:val="es-VE" w:eastAsia="es-VE"/>
+              </w:rPr>
+              <w:t>}</w:t>
+            </w:r>
           </w:p>
         </w:tc>
         <w:tc>
           <w:tcPr>
-            <w:tcW w:w="2258" w:type="dxa"/>
+            <w:tcW w:w="1836" w:type="dxa"/>
             <w:tcBorders>
               <w:top w:val="nil"/>
               <w:left w:val="nil"/>
@@ -759,6 +856,7 @@
               <w:widowControl/>
               <w:autoSpaceDE/>
               <w:autoSpaceDN/>
+              <w:jc w:val="center"/>
               <w:rPr>
                 <w:rFonts w:eastAsia="Times New Roman"/>
                 <w:color w:val="000000"/>
@@ -767,11 +865,21 @@
                 <w:lang w:val="es-VE" w:eastAsia="es-VE"/>
               </w:rPr>
             </w:pPr>
+            <w:r>
+              <w:rPr>
+                <w:rFonts w:eastAsia="Times New Roman"/>
+                <w:color w:val="000000"/>
+                <w:sz w:val="24"/>
+                <w:szCs w:val="24"/>
+                <w:lang w:val="es-VE" w:eastAsia="es-VE"/>
+              </w:rPr>
+              <w:t>{lugar}</w:t>
+            </w:r>
           </w:p>
         </w:tc>
         <w:tc>
           <w:tcPr>
-            <w:tcW w:w="2377" w:type="dxa"/>
+            <w:tcW w:w="2063" w:type="dxa"/>
             <w:tcBorders>
               <w:top w:val="nil"/>
               <w:left w:val="nil"/>
@@ -788,7 +896,7 @@
               <w:widowControl/>
               <w:autoSpaceDE/>
               <w:autoSpaceDN/>
-              <w:jc w:val="right"/>
+              <w:jc w:val="center"/>
               <w:rPr>
                 <w:rFonts w:eastAsia="Times New Roman"/>
                 <w:color w:val="000000"/>
@@ -797,16 +905,26 @@
                 <w:lang w:val="es-VE" w:eastAsia="es-VE"/>
               </w:rPr>
             </w:pPr>
+            <w:r>
+              <w:rPr>
+                <w:rFonts w:eastAsia="Times New Roman"/>
+                <w:color w:val="000000"/>
+                <w:sz w:val="24"/>
+                <w:szCs w:val="24"/>
+                <w:lang w:val="es-VE" w:eastAsia="es-VE"/>
+              </w:rPr>
+              <w:t>{monto}{/facturas}</w:t>
+            </w:r>
           </w:p>
         </w:tc>
       </w:tr>
       <w:tr>
         <w:trPr>
-          <w:trHeight w:val="985"/>
+          <w:trHeight w:val="946"/>
         </w:trPr>
         <w:tc>
           <w:tcPr>
-            <w:tcW w:w="9936" w:type="dxa"/>
+            <w:tcW w:w="10165" w:type="dxa"/>
             <w:gridSpan w:val="5"/>
             <w:tcBorders>
               <w:top w:val="single" w:sz="4" w:space="0" w:color="auto"/>
@@ -846,11 +964,11 @@
       </w:tr>
       <w:tr>
         <w:trPr>
-          <w:trHeight w:val="391"/>
+          <w:trHeight w:val="375"/>
         </w:trPr>
         <w:tc>
           <w:tcPr>
-            <w:tcW w:w="1056" w:type="dxa"/>
+            <w:tcW w:w="1890" w:type="dxa"/>
             <w:tcBorders>
               <w:top w:val="nil"/>
               <w:left w:val="nil"/>
@@ -879,7 +997,7 @@
         </w:tc>
         <w:tc>
           <w:tcPr>
-            <w:tcW w:w="1290" w:type="dxa"/>
+            <w:tcW w:w="1504" w:type="dxa"/>
             <w:tcBorders>
               <w:top w:val="nil"/>
               <w:left w:val="nil"/>
@@ -907,7 +1025,7 @@
         </w:tc>
         <w:tc>
           <w:tcPr>
-            <w:tcW w:w="2955" w:type="dxa"/>
+            <w:tcW w:w="2872" w:type="dxa"/>
             <w:tcBorders>
               <w:top w:val="nil"/>
               <w:left w:val="nil"/>
@@ -935,7 +1053,7 @@
         </w:tc>
         <w:tc>
           <w:tcPr>
-            <w:tcW w:w="2258" w:type="dxa"/>
+            <w:tcW w:w="1836" w:type="dxa"/>
             <w:tcBorders>
               <w:top w:val="nil"/>
               <w:left w:val="nil"/>
@@ -979,7 +1097,7 @@
         </w:tc>
         <w:tc>
           <w:tcPr>
-            <w:tcW w:w="2377" w:type="dxa"/>
+            <w:tcW w:w="2063" w:type="dxa"/>
             <w:tcBorders>
               <w:top w:val="nil"/>
               <w:left w:val="nil"/>

</xml_diff>

<commit_message>
feat: implement DOCX report generation API with template support
</commit_message>
<xml_diff>
--- a/public/template.docx
+++ b/public/template.docx
@@ -245,6 +245,78 @@
           <w:sz w:val="28"/>
         </w:rPr>
       </w:pPr>
+      <w:r>
+        <w:rPr>
+          <w:sz w:val="28"/>
+        </w:rPr>
+        <w:tab/>
+      </w:r>
+      <w:r>
+        <w:rPr>
+          <w:sz w:val="28"/>
+        </w:rPr>
+        <w:tab/>
+      </w:r>
+      <w:r>
+        <w:rPr>
+          <w:sz w:val="28"/>
+        </w:rPr>
+        <w:tab/>
+      </w:r>
+      <w:r>
+        <w:rPr>
+          <w:sz w:val="28"/>
+        </w:rPr>
+        <w:tab/>
+      </w:r>
+      <w:r>
+        <w:rPr>
+          <w:sz w:val="28"/>
+        </w:rPr>
+        <w:tab/>
+      </w:r>
+      <w:r>
+        <w:rPr>
+          <w:sz w:val="28"/>
+        </w:rPr>
+        <w:tab/>
+      </w:r>
+      <w:r>
+        <w:rPr>
+          <w:sz w:val="28"/>
+        </w:rPr>
+        <w:tab/>
+      </w:r>
+      <w:r>
+        <w:rPr>
+          <w:sz w:val="28"/>
+        </w:rPr>
+        <w:tab/>
+      </w:r>
+      <w:r>
+        <w:rPr>
+          <w:sz w:val="28"/>
+        </w:rPr>
+        <w:tab/>
+      </w:r>
+      <w:r>
+        <w:rPr>
+          <w:sz w:val="28"/>
+        </w:rPr>
+        <w:tab/>
+      </w:r>
+      <w:r>
+        <w:rPr>
+          <w:sz w:val="28"/>
+        </w:rPr>
+        <w:tab/>
+      </w:r>
+      <w:r>
+        <w:rPr>
+          <w:sz w:val="28"/>
+        </w:rPr>
+        <w:t>{correlativo}</w:t>
+      </w:r>
     </w:p>
     <w:p>
       <w:pPr>

</xml_diff>